<commit_message>
second checked bug report
</commit_message>
<xml_diff>
--- a/group project/Bug Report 2.docx
+++ b/group project/Bug Report 2.docx
@@ -108,10 +108,7 @@
         <w:t xml:space="preserve"> (</w:t>
       </w:r>
       <w:r>
-        <w:t xml:space="preserve">The </w:t>
-      </w:r>
-      <w:r>
-        <w:t>search by stock button doesn’t work</w:t>
+        <w:t>The search by stock button doesn’t work</w:t>
       </w:r>
       <w:r>
         <w:t>)</w:t>
@@ -209,10 +206,7 @@
         </w:numPr>
       </w:pPr>
       <w:r>
-        <w:t>See the details of</w:t>
-      </w:r>
-      <w:r>
-        <w:t xml:space="preserve"> the book/books</w:t>
+        <w:t>See the details of the book/books</w:t>
       </w:r>
       <w:r>
         <w:t>.</w:t>
@@ -303,6 +297,7 @@
         <w:rPr>
           <w:b/>
           <w:bCs/>
+          <w:noProof/>
         </w:rPr>
         <w:lastRenderedPageBreak/>
         <w:drawing>
@@ -341,21 +336,12 @@
           </wp:inline>
         </w:drawing>
       </w:r>
-      <w:proofErr w:type="gramStart"/>
-      <w:r>
-        <w:rPr>
-          <w:b/>
-          <w:bCs/>
-        </w:rPr>
-        <w:t>( same</w:t>
-      </w:r>
-      <w:proofErr w:type="gramEnd"/>
-      <w:r>
-        <w:rPr>
-          <w:b/>
-          <w:bCs/>
-        </w:rPr>
-        <w:t xml:space="preserve"> happens with highest stock feature)</w:t>
+      <w:r>
+        <w:rPr>
+          <w:b/>
+          <w:bCs/>
+        </w:rPr>
+        <w:t>( same happens with highest stock feature)</w:t>
       </w:r>
     </w:p>
     <w:p>
@@ -388,7 +374,11 @@
       </w:r>
     </w:p>
     <w:p/>
-    <w:p/>
+    <w:p>
+      <w:r>
+        <w:t>I couldn’t fix the issue so I just removed it all together since there were issues with finding out the stock of each book so that feature is removed.</w:t>
+      </w:r>
+    </w:p>
     <w:sectPr>
       <w:pgSz w:w="12240" w:h="15840"/>
       <w:pgMar w:top="1440" w:right="1440" w:bottom="1440" w:left="1440" w:header="720" w:footer="720" w:gutter="0"/>

</xml_diff>